<commit_message>
feat: drop parentheticals from CV summaries, tidy copy
</commit_message>
<xml_diff>
--- a/public/cv/CV.docx
+++ b/public/cv/CV.docx
@@ -182,7 +182,7 @@
               <w:rPr/>
             </w:pPr>
             <w:r>
-              <w:t>Backend ağırlıklı full-stack geliştirmeye odaklanan son sınıf bilgisayar mühendisliği öğrencisiyim (NestJS, PostgreSQL, React). Gerçek ürün çıkaracağım junior ve staj pozisyonları arıyorum.</w:t>
+              <w:t>Backend ağırlıklı full-stack geliştirmeye odaklanan son sınıf bilgisayar mühendisliği öğrencisiyim. Gerçek ürün çıkaracağım junior ve staj pozisyonları arıyorum.</w:t>
             </w:r>
           </w:p>
         </w:tc>
@@ -266,7 +266,7 @@
               <w:rPr/>
             </w:pPr>
             <w:r>
-              <w:t>Ben Muhammet Saraç, Pamukkale Üniversitesi son sınıf Bilgisayar Mühendisliği öğrencisiyim (GPA 3.32). NestJS, PostgreSQL ve React ile backend ağırlıklı web uygulamaları geliştiriyorum. ADM’de (kurumsal BT), FLAP Yazılım’da (yazılım) ve TNC Group’ta (uygulamalı BT) staj yaptım; Erasmus ile Maribor’da okudum.</w:t>
+              <w:t>Pamukkale Üniversitesi son sınıf Bilgisayar Mühendisliği öğrencisiyim. NestJS, PostgreSQL ve React ile backend ağırlıklı web uygulamaları geliştiriyorum. ADM, FLAP Yazılım ve TNC Group’ta staj yaptım; Erasmus ile Maribor’da okudum.</w:t>
             </w:r>
           </w:p>
         </w:tc>

</xml_diff>